<commit_message>
Corrige os movimentos de solfejo conforme o MSA
Conferência dos gabaritos dos movimentos contra materiais que reproduzem o
método, depois de terem sido escritos pela prática corrente de regência.

- compasso em 6 estava errado: não é o padrão clássico de regência, e sim o
  desenho do compasso em 2 com três pulsos por tempo — pontos 1 a 3 abaixo e
  4 a 6 acima, com o movimento amplo entre o 3º e o 4º
- movimentos em 9 e 12 confirmados (desenhos do 3 e do 4), reescritos com os
  movimentos amplos entre os grupos
- movimentos em 2, 3 e 4 confirmados
- gabaritos passam a numerar os pontos, como faz o método: cada movimento vai
  de um ponto ao seguinte
- alternativos reescritos na formulação do método
- leitura rítmica passa a citar a sílaba TA
- acrescentada questão sobre janela de movimento

Banco vai a 259 questões; as oito apostilas foram regeradas.

Co-Authored-By: Claude Opus 5 <noreply@anthropic.com>
Claude-Session: https://claude.ai/code/session_014Qv8vUa47sQ8agnYCob2NZ
</commit_message>
<xml_diff>
--- a/apostila/Apostila-1o-periodo-aluno.docx
+++ b/apostila/Apostila-1o-periodo-aluno.docx
@@ -4180,7 +4180,7 @@
           <w:sz w:val="21"/>
           <w:szCs w:val="21"/>
         </w:rPr>
-        <w:t xml:space="preserve">Marque o pulso com o pé e faça a linguagem rítmica dos dois primeiros compassos do hino indicado.</w:t>
+        <w:t xml:space="preserve">Marque o pulso com o pé e faça a leitura rítmica dos dois primeiros compassos do hino indicado, falando a sílaba TA.</w:t>
       </w:r>
     </w:p>
     <w:p>
@@ -5622,6 +5622,90 @@
           <w:szCs w:val="21"/>
         </w:rPr>
         <w:t xml:space="preserve">3. </w:t>
+      </w:r>
+      <w:r>
+        <w:rPr>
+          <w:rFonts w:ascii="Calibri" w:cs="Calibri" w:eastAsia="Calibri" w:hAnsi="Calibri"/>
+          <w:b/>
+          <w:bCs/>
+          <w:color w:val="1F5673"/>
+          <w:spacing w:val="16"/>
+          <w:sz w:val="16"/>
+          <w:szCs w:val="16"/>
+        </w:rPr>
+        <w:t xml:space="preserve">IDENTIFICAR  </w:t>
+      </w:r>
+      <w:r>
+        <w:rPr>
+          <w:rFonts w:ascii="Calibri" w:cs="Calibri" w:eastAsia="Calibri" w:hAnsi="Calibri"/>
+          <w:color w:val="5C6B75"/>
+          <w:sz w:val="16"/>
+          <w:szCs w:val="16"/>
+        </w:rPr>
+        <w:t xml:space="preserve">nível 1</w:t>
+      </w:r>
+    </w:p>
+    <w:p>
+      <w:pPr>
+        <w:spacing w:after="40" w:line="300"/>
+        <w:ind w:left="340"/>
+      </w:pPr>
+      <w:r>
+        <w:rPr>
+          <w:rFonts w:ascii="Calibri" w:cs="Calibri" w:eastAsia="Calibri" w:hAnsi="Calibri"/>
+          <w:color w:val="16212A"/>
+          <w:sz w:val="21"/>
+          <w:szCs w:val="21"/>
+        </w:rPr>
+        <w:t xml:space="preserve">O que é a janela de movimento?</w:t>
+      </w:r>
+    </w:p>
+    <w:p>
+      <w:pPr>
+        <w:pBdr>
+          <w:bottom w:val="dotted" w:color="AFBAC0" w:sz="6" w:space="2"/>
+        </w:pBdr>
+        <w:spacing w:after="0" w:before="200"/>
+        <w:ind w:left="340"/>
+      </w:pPr>
+      <w:r>
+        <w:rPr>
+          <w:sz w:val="20"/>
+          <w:szCs w:val="20"/>
+        </w:rPr>
+        <w:t xml:space="preserve"/>
+      </w:r>
+    </w:p>
+    <w:p>
+      <w:pPr>
+        <w:pBdr>
+          <w:bottom w:val="dotted" w:color="AFBAC0" w:sz="6" w:space="2"/>
+        </w:pBdr>
+        <w:spacing w:after="0" w:before="200"/>
+        <w:ind w:left="340"/>
+      </w:pPr>
+      <w:r>
+        <w:rPr>
+          <w:sz w:val="20"/>
+          <w:szCs w:val="20"/>
+        </w:rPr>
+        <w:t xml:space="preserve"/>
+      </w:r>
+    </w:p>
+    <w:p>
+      <w:pPr>
+        <w:spacing w:after="60" w:before="260"/>
+      </w:pPr>
+      <w:r>
+        <w:rPr>
+          <w:rFonts w:ascii="Calibri" w:cs="Calibri" w:eastAsia="Calibri" w:hAnsi="Calibri"/>
+          <w:b/>
+          <w:bCs/>
+          <w:color w:val="16212A"/>
+          <w:sz w:val="21"/>
+          <w:szCs w:val="21"/>
+        </w:rPr>
+        <w:t xml:space="preserve">4. </w:t>
       </w:r>
       <w:r>
         <w:rPr>

</xml_diff>